<commit_message>
Universal apply engine logic
</commit_message>
<xml_diff>
--- a/plan.docx
+++ b/plan.docx
@@ -349,7 +349,7 @@
     <w:p>
       <w:r>
         <w:pict w14:anchorId="26C56BF9">
-          <v:rect id="_x0000_i1049" style="width:0;height:1.5pt" o:hralign="center" o:hrstd="t" o:hr="t" fillcolor="#a0a0a0" stroked="f"/>
+          <v:rect id="_x0000_i1025" style="width:0;height:1.5pt" o:hralign="center" o:hrstd="t" o:hr="t" fillcolor="#a0a0a0" stroked="f"/>
         </w:pict>
       </w:r>
     </w:p>
@@ -764,7 +764,7 @@
     <w:p>
       <w:r>
         <w:pict w14:anchorId="7ECBE82D">
-          <v:rect id="_x0000_i1050" style="width:0;height:1.5pt" o:hralign="center" o:hrstd="t" o:hr="t" fillcolor="#a0a0a0" stroked="f"/>
+          <v:rect id="_x0000_i1026" style="width:0;height:1.5pt" o:hralign="center" o:hrstd="t" o:hr="t" fillcolor="#a0a0a0" stroked="f"/>
         </w:pict>
       </w:r>
     </w:p>
@@ -1141,7 +1141,7 @@
     <w:p>
       <w:r>
         <w:pict w14:anchorId="6F96F371">
-          <v:rect id="_x0000_i1051" style="width:0;height:1.5pt" o:hralign="center" o:hrstd="t" o:hr="t" fillcolor="#a0a0a0" stroked="f"/>
+          <v:rect id="_x0000_i1027" style="width:0;height:1.5pt" o:hralign="center" o:hrstd="t" o:hr="t" fillcolor="#a0a0a0" stroked="f"/>
         </w:pict>
       </w:r>
     </w:p>
@@ -1371,7 +1371,7 @@
     <w:p>
       <w:r>
         <w:pict w14:anchorId="0D0621E0">
-          <v:rect id="_x0000_i1052" style="width:0;height:1.5pt" o:hralign="center" o:hrstd="t" o:hr="t" fillcolor="#a0a0a0" stroked="f"/>
+          <v:rect id="_x0000_i1028" style="width:0;height:1.5pt" o:hralign="center" o:hrstd="t" o:hr="t" fillcolor="#a0a0a0" stroked="f"/>
         </w:pict>
       </w:r>
     </w:p>
@@ -1476,6 +1476,743 @@
         <w:t>Build first working demo: guest mode resume + cover letter generation</w:t>
       </w:r>
     </w:p>
+    <w:p>
+      <w:pPr>
+        <w:pBdr>
+          <w:bottom w:val="single" w:sz="12" w:space="1" w:color="auto"/>
+        </w:pBdr>
+      </w:pPr>
+    </w:p>
+    <w:p/>
+    <w:p>
+      <w:pPr>
+        <w:rPr>
+          <w:b/>
+          <w:bCs/>
+        </w:rPr>
+      </w:pPr>
+      <w:r>
+        <w:rPr>
+          <w:rFonts w:ascii="Segoe UI Emoji" w:hAnsi="Segoe UI Emoji" w:cs="Segoe UI Emoji"/>
+          <w:b/>
+          <w:bCs/>
+        </w:rPr>
+        <w:t>🧠</w:t>
+      </w:r>
+      <w:r>
+        <w:rPr>
+          <w:b/>
+          <w:bCs/>
+        </w:rPr>
+        <w:t xml:space="preserve"> Question 2:</w:t>
+      </w:r>
+    </w:p>
+    <w:p>
+      <w:r>
+        <w:t>“Can I later restrict scraping/applying from certain job sites based on user's subscription?”</w:t>
+      </w:r>
+    </w:p>
+    <w:p>
+      <w:pPr>
+        <w:rPr>
+          <w:b/>
+          <w:bCs/>
+        </w:rPr>
+      </w:pPr>
+      <w:r>
+        <w:rPr>
+          <w:rFonts w:ascii="Segoe UI Emoji" w:hAnsi="Segoe UI Emoji" w:cs="Segoe UI Emoji"/>
+          <w:b/>
+          <w:bCs/>
+        </w:rPr>
+        <w:t>✅</w:t>
+      </w:r>
+      <w:r>
+        <w:rPr>
+          <w:b/>
+          <w:bCs/>
+        </w:rPr>
+        <w:t xml:space="preserve"> Absolutely YES — and here’s how you design it:</w:t>
+      </w:r>
+    </w:p>
+    <w:p>
+      <w:pPr>
+        <w:rPr>
+          <w:b/>
+          <w:bCs/>
+        </w:rPr>
+      </w:pPr>
+      <w:r>
+        <w:rPr>
+          <w:b/>
+          <w:bCs/>
+        </w:rPr>
+        <w:t>Example:</w:t>
+      </w:r>
+    </w:p>
+    <w:p>
+      <w:r>
+        <w:t>Store this in MongoDB or any DB:</w:t>
+      </w:r>
+    </w:p>
+    <w:p>
+      <w:proofErr w:type="spellStart"/>
+      <w:r>
+        <w:t>json</w:t>
+      </w:r>
+      <w:proofErr w:type="spellEnd"/>
+    </w:p>
+    <w:p>
+      <w:r>
+        <w:t>Copy</w:t>
+      </w:r>
+    </w:p>
+    <w:p>
+      <w:r>
+        <w:t>{</w:t>
+      </w:r>
+    </w:p>
+    <w:p>
+      <w:r>
+        <w:t xml:space="preserve">  "</w:t>
+      </w:r>
+      <w:proofErr w:type="spellStart"/>
+      <w:proofErr w:type="gramStart"/>
+      <w:r>
+        <w:t>user</w:t>
+      </w:r>
+      <w:proofErr w:type="gramEnd"/>
+      <w:r>
+        <w:t>_id</w:t>
+      </w:r>
+      <w:proofErr w:type="spellEnd"/>
+      <w:r>
+        <w:t>": "john@example.com",</w:t>
+      </w:r>
+    </w:p>
+    <w:p>
+      <w:r>
+        <w:t xml:space="preserve">  "</w:t>
+      </w:r>
+      <w:proofErr w:type="spellStart"/>
+      <w:proofErr w:type="gramStart"/>
+      <w:r>
+        <w:t>subscription</w:t>
+      </w:r>
+      <w:proofErr w:type="gramEnd"/>
+      <w:r>
+        <w:t>_tier</w:t>
+      </w:r>
+      <w:proofErr w:type="spellEnd"/>
+      <w:r>
+        <w:t>": "guest",</w:t>
+      </w:r>
+    </w:p>
+    <w:p>
+      <w:r>
+        <w:t xml:space="preserve">  "</w:t>
+      </w:r>
+      <w:proofErr w:type="spellStart"/>
+      <w:proofErr w:type="gramStart"/>
+      <w:r>
+        <w:t>allowed</w:t>
+      </w:r>
+      <w:proofErr w:type="gramEnd"/>
+      <w:r>
+        <w:t>_sites</w:t>
+      </w:r>
+      <w:proofErr w:type="spellEnd"/>
+      <w:r>
+        <w:t>": ["seek</w:t>
+      </w:r>
+      <w:proofErr w:type="gramStart"/>
+      <w:r>
+        <w:t>"]  /</w:t>
+      </w:r>
+      <w:proofErr w:type="gramEnd"/>
+      <w:r>
+        <w:t>/ or empty for premium = all</w:t>
+      </w:r>
+    </w:p>
+    <w:p>
+      <w:r>
+        <w:lastRenderedPageBreak/>
+        <w:t>}</w:t>
+      </w:r>
+    </w:p>
+    <w:p>
+      <w:r>
+        <w:t>Then in your bot logic:</w:t>
+      </w:r>
+    </w:p>
+    <w:p>
+      <w:r>
+        <w:t>python</w:t>
+      </w:r>
+    </w:p>
+    <w:p>
+      <w:r>
+        <w:t>Copy</w:t>
+      </w:r>
+    </w:p>
+    <w:p>
+      <w:r>
+        <w:t>if user["</w:t>
+      </w:r>
+      <w:proofErr w:type="spellStart"/>
+      <w:r>
+        <w:t>subscription_tier</w:t>
+      </w:r>
+      <w:proofErr w:type="spellEnd"/>
+      <w:r>
+        <w:t>"] == "guest":</w:t>
+      </w:r>
+    </w:p>
+    <w:p>
+      <w:r>
+        <w:t xml:space="preserve">    </w:t>
+      </w:r>
+      <w:proofErr w:type="spellStart"/>
+      <w:r>
+        <w:t>job_sites</w:t>
+      </w:r>
+      <w:proofErr w:type="spellEnd"/>
+      <w:r>
+        <w:t xml:space="preserve"> = ["seek"]</w:t>
+      </w:r>
+    </w:p>
+    <w:p>
+      <w:r>
+        <w:t>else:</w:t>
+      </w:r>
+    </w:p>
+    <w:p>
+      <w:r>
+        <w:t xml:space="preserve">    </w:t>
+      </w:r>
+      <w:proofErr w:type="spellStart"/>
+      <w:r>
+        <w:t>job_sites</w:t>
+      </w:r>
+      <w:proofErr w:type="spellEnd"/>
+      <w:r>
+        <w:t xml:space="preserve"> = ["seek", "</w:t>
+      </w:r>
+      <w:proofErr w:type="spellStart"/>
+      <w:r>
+        <w:t>linkedin</w:t>
+      </w:r>
+      <w:proofErr w:type="spellEnd"/>
+      <w:r>
+        <w:t>", "greenhouse", "lever", "workday"]</w:t>
+      </w:r>
+    </w:p>
+    <w:p>
+      <w:r>
+        <w:t>Or go more granular:</w:t>
+      </w:r>
+    </w:p>
+    <w:p>
+      <w:r>
+        <w:t>python</w:t>
+      </w:r>
+    </w:p>
+    <w:p>
+      <w:r>
+        <w:t>Copy</w:t>
+      </w:r>
+    </w:p>
+    <w:p>
+      <w:r>
+        <w:t>"</w:t>
+      </w:r>
+      <w:proofErr w:type="spellStart"/>
+      <w:proofErr w:type="gramStart"/>
+      <w:r>
+        <w:t>allowed</w:t>
+      </w:r>
+      <w:proofErr w:type="gramEnd"/>
+      <w:r>
+        <w:t>_sites</w:t>
+      </w:r>
+      <w:proofErr w:type="spellEnd"/>
+      <w:r>
+        <w:t>": ["seek", "</w:t>
+      </w:r>
+      <w:proofErr w:type="spellStart"/>
+      <w:r>
+        <w:t>linkedin</w:t>
+      </w:r>
+      <w:proofErr w:type="spellEnd"/>
+      <w:r>
+        <w:t>"]</w:t>
+      </w:r>
+    </w:p>
+    <w:p>
+      <w:r>
+        <w:t>And check before scraping/applying:</w:t>
+      </w:r>
+    </w:p>
+    <w:p>
+      <w:r>
+        <w:t>python</w:t>
+      </w:r>
+    </w:p>
+    <w:p>
+      <w:r>
+        <w:t>Copy</w:t>
+      </w:r>
+    </w:p>
+    <w:p>
+      <w:r>
+        <w:t>if "greenhouse" in user["</w:t>
+      </w:r>
+      <w:proofErr w:type="spellStart"/>
+      <w:r>
+        <w:t>allowed_sites</w:t>
+      </w:r>
+      <w:proofErr w:type="spellEnd"/>
+      <w:r>
+        <w:t>"]:</w:t>
+      </w:r>
+    </w:p>
+    <w:p>
+      <w:r>
+        <w:t xml:space="preserve">    </w:t>
+      </w:r>
+      <w:proofErr w:type="spellStart"/>
+      <w:r>
+        <w:t>scrape_greenhouse_jobs</w:t>
+      </w:r>
+      <w:proofErr w:type="spellEnd"/>
+      <w:r>
+        <w:t>(...)</w:t>
+      </w:r>
+    </w:p>
+    <w:p>
+      <w:r>
+        <w:pict w14:anchorId="62ACC46B">
+          <v:rect id="_x0000_i1041" style="width:0;height:1.5pt" o:hralign="center" o:hrstd="t" o:hr="t" fillcolor="#a0a0a0" stroked="f"/>
+        </w:pict>
+      </w:r>
+    </w:p>
+    <w:p>
+      <w:pPr>
+        <w:rPr>
+          <w:b/>
+          <w:bCs/>
+        </w:rPr>
+      </w:pPr>
+      <w:r>
+        <w:rPr>
+          <w:rFonts w:ascii="Segoe UI Emoji" w:hAnsi="Segoe UI Emoji" w:cs="Segoe UI Emoji"/>
+          <w:b/>
+          <w:bCs/>
+        </w:rPr>
+        <w:t>💡</w:t>
+      </w:r>
+      <w:r>
+        <w:rPr>
+          <w:b/>
+          <w:bCs/>
+        </w:rPr>
+        <w:t xml:space="preserve"> Real-World Examples:</w:t>
+      </w:r>
+    </w:p>
+    <w:tbl>
+      <w:tblPr>
+        <w:tblW w:w="0" w:type="auto"/>
+        <w:tblCellSpacing w:w="15" w:type="dxa"/>
+        <w:tblCellMar>
+          <w:top w:w="15" w:type="dxa"/>
+          <w:left w:w="15" w:type="dxa"/>
+          <w:bottom w:w="15" w:type="dxa"/>
+          <w:right w:w="15" w:type="dxa"/>
+        </w:tblCellMar>
+        <w:tblLook w:val="04A0" w:firstRow="1" w:lastRow="0" w:firstColumn="1" w:lastColumn="0" w:noHBand="0" w:noVBand="1"/>
+      </w:tblPr>
+      <w:tblGrid>
+        <w:gridCol w:w="1471"/>
+        <w:gridCol w:w="2185"/>
+      </w:tblGrid>
+      <w:tr>
+        <w:trPr>
+          <w:tblHeader/>
+          <w:tblCellSpacing w:w="15" w:type="dxa"/>
+        </w:trPr>
+        <w:tc>
+          <w:tcPr>
+            <w:tcW w:w="0" w:type="auto"/>
+            <w:vAlign w:val="center"/>
+            <w:hideMark/>
+          </w:tcPr>
+          <w:p>
+            <w:pPr>
+              <w:rPr>
+                <w:b/>
+                <w:bCs/>
+              </w:rPr>
+            </w:pPr>
+            <w:r>
+              <w:rPr>
+                <w:b/>
+                <w:bCs/>
+              </w:rPr>
+              <w:t>Subscription</w:t>
+            </w:r>
+          </w:p>
+        </w:tc>
+        <w:tc>
+          <w:tcPr>
+            <w:tcW w:w="0" w:type="auto"/>
+            <w:vAlign w:val="center"/>
+            <w:hideMark/>
+          </w:tcPr>
+          <w:p>
+            <w:pPr>
+              <w:rPr>
+                <w:b/>
+                <w:bCs/>
+              </w:rPr>
+            </w:pPr>
+            <w:r>
+              <w:rPr>
+                <w:b/>
+                <w:bCs/>
+              </w:rPr>
+              <w:t>Allowed Job Boards</w:t>
+            </w:r>
+          </w:p>
+        </w:tc>
+      </w:tr>
+      <w:tr>
+        <w:trPr>
+          <w:tblCellSpacing w:w="15" w:type="dxa"/>
+        </w:trPr>
+        <w:tc>
+          <w:tcPr>
+            <w:tcW w:w="0" w:type="auto"/>
+            <w:vAlign w:val="center"/>
+            <w:hideMark/>
+          </w:tcPr>
+          <w:p>
+            <w:r>
+              <w:t>Guest</w:t>
+            </w:r>
+          </w:p>
+        </w:tc>
+        <w:tc>
+          <w:tcPr>
+            <w:tcW w:w="0" w:type="auto"/>
+            <w:vAlign w:val="center"/>
+            <w:hideMark/>
+          </w:tcPr>
+          <w:p>
+            <w:r>
+              <w:t>Seek only</w:t>
+            </w:r>
+          </w:p>
+        </w:tc>
+      </w:tr>
+      <w:tr>
+        <w:trPr>
+          <w:tblCellSpacing w:w="15" w:type="dxa"/>
+        </w:trPr>
+        <w:tc>
+          <w:tcPr>
+            <w:tcW w:w="0" w:type="auto"/>
+            <w:vAlign w:val="center"/>
+            <w:hideMark/>
+          </w:tcPr>
+          <w:p>
+            <w:r>
+              <w:t>Premium</w:t>
+            </w:r>
+          </w:p>
+        </w:tc>
+        <w:tc>
+          <w:tcPr>
+            <w:tcW w:w="0" w:type="auto"/>
+            <w:vAlign w:val="center"/>
+            <w:hideMark/>
+          </w:tcPr>
+          <w:p>
+            <w:r>
+              <w:t>All</w:t>
+            </w:r>
+          </w:p>
+        </w:tc>
+      </w:tr>
+      <w:tr>
+        <w:trPr>
+          <w:tblCellSpacing w:w="15" w:type="dxa"/>
+        </w:trPr>
+        <w:tc>
+          <w:tcPr>
+            <w:tcW w:w="0" w:type="auto"/>
+            <w:vAlign w:val="center"/>
+            <w:hideMark/>
+          </w:tcPr>
+          <w:p>
+            <w:r>
+              <w:t>Pro</w:t>
+            </w:r>
+          </w:p>
+        </w:tc>
+        <w:tc>
+          <w:tcPr>
+            <w:tcW w:w="0" w:type="auto"/>
+            <w:vAlign w:val="center"/>
+            <w:hideMark/>
+          </w:tcPr>
+          <w:p>
+            <w:r>
+              <w:t>All + Auto-Apply</w:t>
+            </w:r>
+          </w:p>
+        </w:tc>
+      </w:tr>
+    </w:tbl>
+    <w:p>
+      <w:r>
+        <w:t>You just gate those in your job loop.</w:t>
+      </w:r>
+    </w:p>
+    <w:p>
+      <w:r>
+        <w:pict w14:anchorId="18F819A3">
+          <v:rect id="_x0000_i1042" style="width:0;height:1.5pt" o:hralign="center" o:hrstd="t" o:hr="t" fillcolor="#a0a0a0" stroked="f"/>
+        </w:pict>
+      </w:r>
+    </w:p>
+    <w:p>
+      <w:pPr>
+        <w:rPr>
+          <w:b/>
+          <w:bCs/>
+        </w:rPr>
+      </w:pPr>
+      <w:r>
+        <w:rPr>
+          <w:rFonts w:ascii="Segoe UI Emoji" w:hAnsi="Segoe UI Emoji" w:cs="Segoe UI Emoji"/>
+          <w:b/>
+          <w:bCs/>
+        </w:rPr>
+        <w:t>🧠</w:t>
+      </w:r>
+      <w:r>
+        <w:rPr>
+          <w:b/>
+          <w:bCs/>
+        </w:rPr>
+        <w:t xml:space="preserve"> Summary</w:t>
+      </w:r>
+    </w:p>
+    <w:tbl>
+      <w:tblPr>
+        <w:tblW w:w="0" w:type="auto"/>
+        <w:tblCellSpacing w:w="15" w:type="dxa"/>
+        <w:tblCellMar>
+          <w:top w:w="15" w:type="dxa"/>
+          <w:left w:w="15" w:type="dxa"/>
+          <w:bottom w:w="15" w:type="dxa"/>
+          <w:right w:w="15" w:type="dxa"/>
+        </w:tblCellMar>
+        <w:tblLook w:val="04A0" w:firstRow="1" w:lastRow="0" w:firstColumn="1" w:lastColumn="0" w:noHBand="0" w:noVBand="1"/>
+      </w:tblPr>
+      <w:tblGrid>
+        <w:gridCol w:w="2762"/>
+        <w:gridCol w:w="4688"/>
+      </w:tblGrid>
+      <w:tr>
+        <w:trPr>
+          <w:tblHeader/>
+          <w:tblCellSpacing w:w="15" w:type="dxa"/>
+        </w:trPr>
+        <w:tc>
+          <w:tcPr>
+            <w:tcW w:w="0" w:type="auto"/>
+            <w:vAlign w:val="center"/>
+            <w:hideMark/>
+          </w:tcPr>
+          <w:p>
+            <w:pPr>
+              <w:rPr>
+                <w:b/>
+                <w:bCs/>
+              </w:rPr>
+            </w:pPr>
+            <w:r>
+              <w:rPr>
+                <w:b/>
+                <w:bCs/>
+              </w:rPr>
+              <w:lastRenderedPageBreak/>
+              <w:t>Goal</w:t>
+            </w:r>
+          </w:p>
+        </w:tc>
+        <w:tc>
+          <w:tcPr>
+            <w:tcW w:w="0" w:type="auto"/>
+            <w:vAlign w:val="center"/>
+            <w:hideMark/>
+          </w:tcPr>
+          <w:p>
+            <w:pPr>
+              <w:rPr>
+                <w:b/>
+                <w:bCs/>
+              </w:rPr>
+            </w:pPr>
+            <w:r>
+              <w:rPr>
+                <w:b/>
+                <w:bCs/>
+              </w:rPr>
+              <w:t>Solution</w:t>
+            </w:r>
+          </w:p>
+        </w:tc>
+      </w:tr>
+      <w:tr>
+        <w:trPr>
+          <w:tblCellSpacing w:w="15" w:type="dxa"/>
+        </w:trPr>
+        <w:tc>
+          <w:tcPr>
+            <w:tcW w:w="0" w:type="auto"/>
+            <w:vAlign w:val="center"/>
+            <w:hideMark/>
+          </w:tcPr>
+          <w:p>
+            <w:r>
+              <w:t>Background scraping</w:t>
+            </w:r>
+          </w:p>
+        </w:tc>
+        <w:tc>
+          <w:tcPr>
+            <w:tcW w:w="0" w:type="auto"/>
+            <w:vAlign w:val="center"/>
+            <w:hideMark/>
+          </w:tcPr>
+          <w:p>
+            <w:r>
+              <w:rPr>
+                <w:rFonts w:ascii="Segoe UI Emoji" w:hAnsi="Segoe UI Emoji" w:cs="Segoe UI Emoji"/>
+              </w:rPr>
+              <w:t>✅</w:t>
+            </w:r>
+            <w:r>
+              <w:t xml:space="preserve"> Script in bots/runner.py, run via </w:t>
+            </w:r>
+            <w:proofErr w:type="spellStart"/>
+            <w:r>
+              <w:t>cron</w:t>
+            </w:r>
+            <w:proofErr w:type="spellEnd"/>
+            <w:r>
+              <w:t>/task</w:t>
+            </w:r>
+          </w:p>
+        </w:tc>
+      </w:tr>
+      <w:tr>
+        <w:trPr>
+          <w:tblCellSpacing w:w="15" w:type="dxa"/>
+        </w:trPr>
+        <w:tc>
+          <w:tcPr>
+            <w:tcW w:w="0" w:type="auto"/>
+            <w:vAlign w:val="center"/>
+            <w:hideMark/>
+          </w:tcPr>
+          <w:p>
+            <w:r>
+              <w:t>No user trigger needed</w:t>
+            </w:r>
+          </w:p>
+        </w:tc>
+        <w:tc>
+          <w:tcPr>
+            <w:tcW w:w="0" w:type="auto"/>
+            <w:vAlign w:val="center"/>
+            <w:hideMark/>
+          </w:tcPr>
+          <w:p>
+            <w:r>
+              <w:rPr>
+                <w:rFonts w:ascii="Segoe UI Emoji" w:hAnsi="Segoe UI Emoji" w:cs="Segoe UI Emoji"/>
+              </w:rPr>
+              <w:t>✅</w:t>
+            </w:r>
+            <w:r>
+              <w:t xml:space="preserve"> It runs on a timer or queue</w:t>
+            </w:r>
+          </w:p>
+        </w:tc>
+      </w:tr>
+      <w:tr>
+        <w:trPr>
+          <w:tblCellSpacing w:w="15" w:type="dxa"/>
+        </w:trPr>
+        <w:tc>
+          <w:tcPr>
+            <w:tcW w:w="0" w:type="auto"/>
+            <w:vAlign w:val="center"/>
+            <w:hideMark/>
+          </w:tcPr>
+          <w:p>
+            <w:r>
+              <w:t>Monetization-based limits</w:t>
+            </w:r>
+          </w:p>
+        </w:tc>
+        <w:tc>
+          <w:tcPr>
+            <w:tcW w:w="0" w:type="auto"/>
+            <w:vAlign w:val="center"/>
+            <w:hideMark/>
+          </w:tcPr>
+          <w:p>
+            <w:r>
+              <w:rPr>
+                <w:rFonts w:ascii="Segoe UI Emoji" w:hAnsi="Segoe UI Emoji" w:cs="Segoe UI Emoji"/>
+              </w:rPr>
+              <w:t>✅</w:t>
+            </w:r>
+            <w:r>
+              <w:t xml:space="preserve"> Use </w:t>
+            </w:r>
+            <w:proofErr w:type="spellStart"/>
+            <w:r>
+              <w:t>allowed_</w:t>
+            </w:r>
+            <w:proofErr w:type="gramStart"/>
+            <w:r>
+              <w:t>sites</w:t>
+            </w:r>
+            <w:proofErr w:type="spellEnd"/>
+            <w:r>
+              <w:t>[</w:t>
+            </w:r>
+            <w:proofErr w:type="gramEnd"/>
+            <w:r>
+              <w:t>] from DB per user</w:t>
+            </w:r>
+          </w:p>
+        </w:tc>
+      </w:tr>
+    </w:tbl>
+    <w:p>
+      <w:pPr>
+        <w:pBdr>
+          <w:bottom w:val="single" w:sz="12" w:space="1" w:color="auto"/>
+        </w:pBdr>
+      </w:pPr>
+    </w:p>
+    <w:p/>
     <w:p/>
     <w:sectPr>
       <w:pgSz w:w="11906" w:h="16838"/>

</xml_diff>